<commit_message>
Cap nhat code tinh nang moi 1810
</commit_message>
<xml_diff>
--- a/hotel_booking/artifacts/TETRA_DANH_MUC_CHUC_NANG_VA_LUONG_NGHIEP_VU_2026-10-18.docx
+++ b/hotel_booking/artifacts/TETRA_DANH_MUC_CHUC_NANG_VA_LUONG_NGHIEP_VU_2026-10-18.docx
@@ -484,7 +484,7 @@
       </w:pPr>
       <w:r>
         <w:rPr/>
-        <w:t xml:space="preserve">Đăng nhập Google/Facebook và liên kết hai nhà cung cấp này đang chờ cấu hình OAuth. Quên mật khẩu có luồng email nhưng chưa có SMTP để gửi thư thật. Mở khóa sinh trắc học/mã khóa máy là bảo vệ phiên đã đăng nhập, không thay thế tài khoản và không tạo phiên mới khi token đã hết hạn.</w:t>
+        <w:t xml:space="preserve">Đăng nhập Google/Facebook và liên kết hai nhà cung cấp này đang chờ cấu hình OAuth. Quên mật khẩu có luồng email nhưng chưa có SMTP để gửi thư thật. Cập nhật tiếp theo ngày 18/10: đăng nhập vân tay đã chuyển sang nút ở màn đăng nhập. Sau khi bật một lần cho tài khoản/thiết bị, có thể đăng nhập không nhập email/mật khẩu; server cấp phiên mới khi chữ ký thiết bị hợp lệ. Không còn bước quét để vào phiên sau mật khẩu.</w:t>
       </w:r>
     </w:p>
     <w:p>
@@ -6132,7 +6132,7 @@
               <w:rPr>
                 <w:sz w:val="20"/>
               </w:rPr>
-              <w:t xml:space="preserve">Chọn thư viện/chụp, căn/cắt, xem trước, xác nhận upload, URL ảnh mới; có khôi phục ảnh picker dang dở sau Android hủy tiến trình. Chưa nghiệm thu đủ trên điện thoại.</w:t>
+              <w:t xml:space="preserve">Chọn thư viện/chụp, căn/cắt, xem trước, xác nhận upload, URL ảnh mới; có khôi phục ảnh picker dang dở. Đã nghiệm thu chọn ảnh thư viện → kéo/reset/căn lại → preview/lưu trên SM A135F, sửa lệch crop bằng tọa độ ảnh hiển thị. Camera/hủy tiến trình còn chưa đủ.</w:t>
             </w:r>
           </w:p>
         </w:tc>
@@ -6981,26 +6981,26 @@
               <w:rPr>
                 <w:sz w:val="20"/>
               </w:rPr>
-              <w:t xml:space="preserve">Khóa phiên thiết bị</w:t>
-            </w:r>
-          </w:p>
-        </w:tc>
-        <w:tc>
-          <w:tcPr>
-            <w:tcW w:w="5560" w:type="dxa"/>
-            <w:shd w:fill="FFFFFF"/>
-            <w:vAlign w:val="top"/>
-          </w:tcPr>
-          <w:p>
-            <w:pPr>
-              <w:pStyle w:val="Normal"/>
-              <w:spacing w:before="30" w:after="45" w:line="240" w:lineRule="auto"/>
-            </w:pPr>
-            <w:r>
-              <w:rPr>
-                <w:sz w:val="20"/>
-              </w:rPr>
-              <w:t xml:space="preserve">Bật riêng từng tài khoản; sinh trắc/mã khóa máy khi mở app hoặc sau hơn 30 giây nền; không vượt qua JWT hết hạn. Chưa nghiệm thu OS trọn luồng.</w:t>
+              <w:t xml:space="preserve">Đăng nhập bằng vân tay</w:t>
+            </w:r>
+          </w:p>
+        </w:tc>
+        <w:tc>
+          <w:tcPr>
+            <w:tcW w:w="5560" w:type="dxa"/>
+            <w:shd w:fill="FFFFFF"/>
+            <w:vAlign w:val="top"/>
+          </w:tcPr>
+          <w:p>
+            <w:pPr>
+              <w:pStyle w:val="Normal"/>
+              <w:spacing w:before="30" w:after="45" w:line="240" w:lineRule="auto"/>
+            </w:pPr>
+            <w:r>
+              <w:rPr>
+                <w:sz w:val="20"/>
+              </w:rPr>
+              <w:t xml:space="preserve">Bật một lần trong Cài đặt, xác nhận mật khẩu và vân tay để đăng ký. Lần sau bấm vân tay ở màn đăng nhập, không nhập email/mật khẩu; ký challenge Keystore để server cấp JWT mới. Bỏ khóa phiên sau 30 giây. Tắt để thu hồi; xem báo cáo nghiệm thu hồ sơ/vân tay mới.</w:t>
             </w:r>
           </w:p>
         </w:tc>
@@ -9504,43 +9504,52 @@
       </w:pPr>
       <w:r>
         <w:rPr/>
-        <w:t xml:space="preserve">L32. Khóa phiên bằng xác thực thiết bị</w:t>
-      </w:r>
-    </w:p>
-    <w:p>
-      <w:pPr>
-        <w:pStyle w:val="ListParagraph"/>
-      </w:pPr>
-      <w:r>
-        <w:rPr/>
-        <w:t xml:space="preserve">1. Đăng nhập → menu → Cài đặt → bật Khóa phiên bằng xác thực thiết bị.</w:t>
-      </w:r>
-    </w:p>
-    <w:p>
-      <w:pPr>
-        <w:pStyle w:val="ListParagraph"/>
-      </w:pPr>
-      <w:r>
-        <w:rPr/>
-        <w:t xml:space="preserve">2. Xác nhận sinh trắc học hoặc mã khóa qua hộp thoại của hệ điều hành; không nhập mã khóa vào chat/app form thường.</w:t>
-      </w:r>
-    </w:p>
-    <w:p>
-      <w:pPr>
-        <w:pStyle w:val="ListParagraph"/>
-      </w:pPr>
-      <w:r>
-        <w:rPr/>
-        <w:t xml:space="preserve">3. Mở lại app hoặc để nền hơn 30 giây → xác thực lại để mở phiên.</w:t>
-      </w:r>
-    </w:p>
-    <w:p>
-      <w:pPr>
-        <w:pStyle w:val="ListParagraph"/>
-      </w:pPr>
-      <w:r>
-        <w:rPr/>
-        <w:t xml:space="preserve">4. Nếu token hết hạn vẫn đăng nhập bằng tài khoản; nếu không mở được, dùng lựa chọn đăng xuất/đăng nhập lại. Chưa nghiệm thu đủ trên thiết bị; không tự đăng ký vân tay cho chủ máy.</w:t>
+        <w:t xml:space="preserve">L32. Đăng nhập bằng vân tay</w:t>
+      </w:r>
+    </w:p>
+    <w:p>
+      <w:pPr>
+        <w:pStyle w:val="ListParagraph"/>
+      </w:pPr>
+      <w:r>
+        <w:rPr/>
+        <w:t xml:space="preserve">1. Đăng nhập mật khẩu lần đầu → menu → Cài đặt → bật Đăng nhập bằng vân tay.</w:t>
+      </w:r>
+    </w:p>
+    <w:p>
+      <w:pPr>
+        <w:pStyle w:val="ListParagraph"/>
+      </w:pPr>
+      <w:r>
+        <w:rPr/>
+        <w:t xml:space="preserve">2. Xác nhận mật khẩu tài khoản một lần → Tiếp tục → chạm cảm biến trong hộp thoại hệ thống để đăng ký điện thoại. Không lưu mật khẩu hoặc ảnh vân tay.</w:t>
+      </w:r>
+    </w:p>
+    <w:p>
+      <w:pPr>
+        <w:pStyle w:val="ListParagraph"/>
+      </w:pPr>
+      <w:r>
+        <w:rPr/>
+        <w:t xml:space="preserve">3. Đăng xuất hoặc mở lại app → Tài khoản → Đăng nhập / Đăng ký → Đăng nhập bằng vân tay; không cần điền email/mật khẩu → chạm cảm biến.</w:t>
+      </w:r>
+    </w:p>
+    <w:p>
+      <w:pPr>
+        <w:pStyle w:val="ListParagraph"/>
+      </w:pPr>
+      <w:r>
+        <w:rPr/>
+        <w:t xml:space="preserve">4. Backend xác minh chữ ký thử thách và cấp phiên mới. Hủy hoặc không được nhận diện thì dùng email/mật khẩu; không hỏi quét thêm sau đăng nhập mật khẩu.</w:t>
+      </w:r>
+    </w:p>
+    <w:p>
+      <w:pPr>
+        <w:pStyle w:val="ListParagraph"/>
+      </w:pPr>
+      <w:r>
+        <w:rPr/>
+        <w:t xml:space="preserve">5. Mỗi máy lưu một tài khoản, đăng xuất vẫn giữ lựa chọn; tắt trong Cài đặt để thu hồi khi dùng máy chung. Đổi mật khẩu/quyền, thay vân tay hoặc quá 90 ngày có thể cần đăng nhập mật khẩu và bật lại. Không tự đăng ký vân tay/PIN OS hộ người dùng.</w:t>
       </w:r>
     </w:p>
     <w:p>
@@ -11456,7 +11465,7 @@
               <w:rPr>
                 <w:sz w:val="20"/>
               </w:rPr>
-              <w:t xml:space="preserve">Upload/quyền/giới hạn API có kiểm thử; chưa thao tác đủ chọn/chụp/crop/cancel/Android mất tiến trình trên điện thoại.</w:t>
+              <w:t xml:space="preserve">Avatar thư viện → kéo/reset/preview/căn lại/lưu đã đạt trên máy, có đối chiếu pixel và ảnh hồ sơ. Camera, crop ảnh phòng với đủ tỷ lệ/hủy, Android mất tiến trình và thao tác pinch hai ngón trên máy chưa được nghiệm thu đầy đủ.</w:t>
             </w:r>
           </w:p>
         </w:tc>
@@ -11518,7 +11527,7 @@
               <w:rPr>
                 <w:sz w:val="20"/>
               </w:rPr>
-              <w:t xml:space="preserve">Widget và bảo mật ảnh private được thử; điện thoại mới gửi text, chưa hoàn tất chụp/chú thích/xem/bỏ/gửi ảnh thật.</w:t>
+              <w:t xml:space="preserve">Đã chụp, vẽ chú thích, xem trước và gửi ảnh trên SM A135F; ảnh có nét vẽ, lưu private, không đăng nhập 401/chủ 200. Chưa nghiệm thu hết các tổ hợp bỏ ảnh, chụp lại, xoay máy và Android hủy tiến trình.</w:t>
             </w:r>
           </w:p>
         </w:tc>
@@ -11685,26 +11694,26 @@
               <w:rPr>
                 <w:sz w:val="20"/>
               </w:rPr>
-              <w:t xml:space="preserve">Khóa sinh trắc/mã khóa</w:t>
-            </w:r>
-          </w:p>
-        </w:tc>
-        <w:tc>
-          <w:tcPr>
-            <w:tcW w:w="5560" w:type="dxa"/>
-            <w:shd w:fill="F4F7FA"/>
-            <w:vAlign w:val="top"/>
-          </w:tcPr>
-          <w:p>
-            <w:pPr>
-              <w:pStyle w:val="Normal"/>
-              <w:spacing w:before="30" w:after="45" w:line="240" w:lineRule="auto"/>
-            </w:pPr>
-            <w:r>
-              <w:rPr>
-                <w:sz w:val="20"/>
-              </w:rPr>
-              <w:t xml:space="preserve">Có mã khóa phiên và giới hạn JWT; chưa nghiệm thu OS đầy đủ bằng phương thức của chủ máy.</w:t>
+              <w:t xml:space="preserve">Đăng nhập vân tay</w:t>
+            </w:r>
+          </w:p>
+        </w:tc>
+        <w:tc>
+          <w:tcPr>
+            <w:tcW w:w="5560" w:type="dxa"/>
+            <w:shd w:fill="F4F7FA"/>
+            <w:vAlign w:val="top"/>
+          </w:tcPr>
+          <w:p>
+            <w:pPr>
+              <w:pStyle w:val="Normal"/>
+              <w:spacing w:before="30" w:after="45" w:line="240" w:lineRule="auto"/>
+            </w:pPr>
+            <w:r>
+              <w:rPr>
+                <w:sz w:val="20"/>
+              </w:rPr>
+              <w:t xml:space="preserve">Chủ máy đã đăng ký và đăng nhập thật không nhập email/mật khẩu, backend cấp JWT mới; đã bỏ khóa phiên. Chưa thay đổi bộ vân tay/PIN của OS để thử vô hiệu hóa khóa, không coi kiểm thử server là thao tác OS.</w:t>
             </w:r>
           </w:p>
         </w:tc>
@@ -13228,16 +13237,16 @@
       </w:pPr>
       <w:r>
         <w:rPr/>
-        <w:t xml:space="preserve">• Backend: 88 ca trong lượt đầy đủ và một ca outbox retry/backoff riêng, tổng 89 ca khác nhau; PostgreSQL thật/hotel_booking_test, không thay SQLite.</w:t>
-      </w:r>
-    </w:p>
-    <w:p>
-      <w:pPr>
-        <w:pStyle w:val="ListParagraph"/>
-      </w:pPr>
-      <w:r>
-        <w:rPr/>
-        <w:t xml:space="preserve">• Flutter: lượt đầy đủ cuối 34/34 đạt; dart analyze lib test không có lỗi; APK ARM debug build/cài thành công trên SM A135F.</w:t>
+        <w:t xml:space="preserve">• Backend mới nhất: 97 đạt trong lượt đầy đủ, 1 kiểm tra metadata cũ sai số bảng; sửa kỳ vọng rồi chạy lại 16/16 unit đạt. Tổng 98 ca khác nhau đã đạt; PostgreSQL thật/hotel_booking_test, không thay SQLite.</w:t>
+      </w:r>
+    </w:p>
+    <w:p>
+      <w:pPr>
+        <w:pStyle w:val="ListParagraph"/>
+      </w:pPr>
+      <w:r>
+        <w:rPr/>
+        <w:t xml:space="preserve">• Flutter mới nhất: lượt đầy đủ 42/42 đạt, có kiểm tra pixel crop và đăng nhập vân tay; APK ARM debug trên SM A135F. Trạng thái analyze/build/nghiệm thu cuối xem docs/profile_biometric_acceptance.md.</w:t>
       </w:r>
     </w:p>
     <w:p>
@@ -13274,6 +13283,15 @@
       <w:r>
         <w:rPr/>
         <w:t xml:space="preserve">• QA dùng dữ liệu test riêng. Sau QA đã đăng xuất tài khoản thử, đưa backend về hotel_booking, đối chiếu dữ liệu không đổi. health/db và tải phòng từ điện thoại HTTP 200 qua Wi-Fi, không adb reverse.</w:t>
+      </w:r>
+    </w:p>
+    <w:p>
+      <w:pPr>
+        <w:pStyle w:val="ListParagraph"/>
+      </w:pPr>
+      <w:r>
+        <w:rPr/>
+        <w:t xml:space="preserve">• Sau đó chủ dự án yêu cầu thêm dữ liệu gốc để quay: đã sao lưu và thêm 12 phòng/23 ảnh, 6 khách/1 lễ tân, 22 đơn/9 đánh giá; không thay bản ghi cũ. Đã chạy kịch bản trên hotel_booking qua UI bằng các tài khoản mới, giữ thêm 1 đơn/1 khoản thu/1 đánh giá. Kịch bản và kết quả ở docs/KICH_BAN_QUAY_TIEN_DO_TETRA.md; không lẫn giai đoạn này với QA cách ly trước đó.</w:t>
       </w:r>
     </w:p>
     <w:p>

</xml_diff>